<commit_message>
Apostila 6 e 6.1
</commit_message>
<xml_diff>
--- a/Apostilas/Basica II/Apostila Básica II de CSharp - Cap 6 - Sistema de Login com Banco de Dados MySQL.docx
+++ b/Apostilas/Basica II/Apostila Básica II de CSharp - Cap 6 - Sistema de Login com Banco de Dados MySQL.docx
@@ -4748,7 +4748,7 @@
           <w:color w:val="BBBEBF"/>
           <w:sz w:val="21"/>
           <w:szCs w:val="21"/>
-          <w:lang w:val="pt-BR" w:eastAsia="pt-BR"/>
+          <w:lang w:val="en-US" w:eastAsia="pt-BR"/>
         </w:rPr>
       </w:pPr>
       <w:r>
@@ -4767,7 +4767,7 @@
           <w:color w:val="BBBEBF"/>
           <w:sz w:val="21"/>
           <w:szCs w:val="21"/>
-          <w:lang w:val="pt-BR" w:eastAsia="pt-BR"/>
+          <w:lang w:val="en-US" w:eastAsia="pt-BR"/>
         </w:rPr>
         <w:t>{</w:t>
       </w:r>
@@ -4790,7 +4790,7 @@
           <w:color w:val="BBBEBF"/>
           <w:sz w:val="21"/>
           <w:szCs w:val="21"/>
-          <w:lang w:val="pt-BR" w:eastAsia="pt-BR"/>
+          <w:lang w:val="en-US" w:eastAsia="pt-BR"/>
         </w:rPr>
         <w:t xml:space="preserve">        </w:t>
       </w:r>
@@ -6607,7 +6607,7 @@
           <w:color w:val="BBBEBF"/>
           <w:sz w:val="21"/>
           <w:szCs w:val="21"/>
-          <w:lang w:val="pt-BR" w:eastAsia="pt-BR"/>
+          <w:lang w:val="en-US" w:eastAsia="pt-BR"/>
         </w:rPr>
       </w:pPr>
       <w:r>
@@ -6626,7 +6626,7 @@
           <w:color w:val="BBBEBF"/>
           <w:sz w:val="21"/>
           <w:szCs w:val="21"/>
-          <w:lang w:val="pt-BR" w:eastAsia="pt-BR"/>
+          <w:lang w:val="en-US" w:eastAsia="pt-BR"/>
         </w:rPr>
         <w:t>}</w:t>
       </w:r>
@@ -6640,7 +6640,7 @@
           <w:color w:val="BBBEBF"/>
           <w:sz w:val="21"/>
           <w:szCs w:val="21"/>
-          <w:lang w:val="pt-BR" w:eastAsia="pt-BR"/>
+          <w:lang w:val="en-US" w:eastAsia="pt-BR"/>
         </w:rPr>
       </w:pPr>
     </w:p>
@@ -6662,9 +6662,19 @@
           <w:color w:val="8B949E"/>
           <w:sz w:val="21"/>
           <w:szCs w:val="21"/>
+          <w:lang w:val="en-US" w:eastAsia="pt-BR"/>
+        </w:rPr>
+        <w:t xml:space="preserve">    </w:t>
+      </w:r>
+      <w:r>
+        <w:rPr>
+          <w:rFonts w:ascii="Consolas" w:eastAsia="Times New Roman" w:hAnsi="Consolas" w:cs="Times New Roman"/>
+          <w:color w:val="8B949E"/>
+          <w:sz w:val="21"/>
+          <w:szCs w:val="21"/>
           <w:lang w:val="pt-BR" w:eastAsia="pt-BR"/>
         </w:rPr>
-        <w:t>    // 4. Salva o novo usuário no banco (POST)</w:t>
+        <w:t>// 4. Salva o novo usuário no banco (POST)</w:t>
       </w:r>
     </w:p>
     <w:p>
@@ -11271,27 +11281,6 @@
           <w:lang w:val="pt-BR"/>
         </w:rPr>
         <w:t xml:space="preserve"> ainda não existem fisicamente no MySQL do computador de vocês.</w:t>
-      </w:r>
-    </w:p>
-    <w:p>
-      <w:pPr>
-        <w:pStyle w:val="Numerada"/>
-        <w:numPr>
-          <w:ilvl w:val="0"/>
-          <w:numId w:val="0"/>
-        </w:numPr>
-        <w:ind w:left="432"/>
-        <w:rPr>
-          <w:noProof/>
-          <w:lang w:val="pt-BR"/>
-        </w:rPr>
-      </w:pPr>
-      <w:r>
-        <w:rPr>
-          <w:noProof/>
-          <w:lang w:val="pt-BR"/>
-        </w:rPr>
-        <w:t>Para que o C# crie as tabelas automaticamente no MySQL baseadas no nosso código, precisamos rodar os comandos de "Migrations" (Migrações) no terminal. Gostaria que eu listasse os comandos de Migrations necessários para gerar o banco agora mesmo?</w:t>
       </w:r>
     </w:p>
     <w:sectPr>
@@ -12703,6 +12692,7 @@
   <w:style w:type="character" w:default="1" w:styleId="Fontepargpadro">
     <w:name w:val="Default Paragraph Font"/>
     <w:uiPriority w:val="1"/>
+    <w:semiHidden/>
     <w:unhideWhenUsed/>
   </w:style>
   <w:style w:type="table" w:default="1" w:styleId="Tabelanormal">
@@ -37651,24 +37641,6 @@
 </file>
 
 <file path=customXml/item1.xml><?xml version="1.0" encoding="utf-8"?>
-<?mso-contentType ?>
-<FormTemplates xmlns="http://schemas.microsoft.com/sharepoint/v3/contenttype/forms">
-  <Display>DocumentLibraryForm</Display>
-  <Edit>DocumentLibraryForm</Edit>
-  <New>DocumentLibraryForm</New>
-</FormTemplates>
-</file>
-
-<file path=customXml/item2.xml><?xml version="1.0" encoding="utf-8"?>
-<p:properties xmlns:p="http://schemas.microsoft.com/office/2006/metadata/properties" xmlns:xsi="http://www.w3.org/2001/XMLSchema-instance" xmlns:pc="http://schemas.microsoft.com/office/infopath/2007/PartnerControls">
-  <documentManagement>
-    <Status xmlns="71af3243-3dd4-4a8d-8c0d-dd76da1f02a5">Not started</Status>
-    <MediaServiceKeyPoints xmlns="71af3243-3dd4-4a8d-8c0d-dd76da1f02a5" xsi:nil="true"/>
-  </documentManagement>
-</p:properties>
-</file>
-
-<file path=customXml/item3.xml><?xml version="1.0" encoding="utf-8"?>
 <ct:contentTypeSchema xmlns:ct="http://schemas.microsoft.com/office/2006/metadata/contentType" xmlns:ma="http://schemas.microsoft.com/office/2006/metadata/properties/metaAttributes" ct:_="" ma:_="" ma:contentTypeName="Document" ma:contentTypeID="0x01010079F111ED35F8CC479449609E8A0923A6" ma:contentTypeVersion="12" ma:contentTypeDescription="Create a new document." ma:contentTypeScope="" ma:versionID="a8a52e8c320b9a064ae3583ae3861c92">
   <xsd:schema xmlns:xsd="http://www.w3.org/2001/XMLSchema" xmlns:xs="http://www.w3.org/2001/XMLSchema" xmlns:p="http://schemas.microsoft.com/office/2006/metadata/properties" xmlns:ns2="71af3243-3dd4-4a8d-8c0d-dd76da1f02a5" xmlns:ns3="16c05727-aa75-4e4a-9b5f-8a80a1165891" targetNamespace="http://schemas.microsoft.com/office/2006/metadata/properties" ma:root="true" ma:fieldsID="88020cb39231a0945110f9cd888b521a" ns2:_="" ns3:_="">
     <xsd:import namespace="71af3243-3dd4-4a8d-8c0d-dd76da1f02a5"/>
@@ -37889,25 +37861,25 @@
 </ct:contentTypeSchema>
 </file>
 
-<file path=customXml/itemProps1.xml><?xml version="1.0" encoding="utf-8"?>
-<ds:datastoreItem xmlns:ds="http://schemas.openxmlformats.org/officeDocument/2006/customXml" ds:itemID="{7B9FE982-DDF9-4F2B-80C6-E4D44711D042}">
-  <ds:schemaRefs>
-    <ds:schemaRef ds:uri="http://schemas.microsoft.com/sharepoint/v3/contenttype/forms"/>
-  </ds:schemaRefs>
-</ds:datastoreItem>
+<file path=customXml/item2.xml><?xml version="1.0" encoding="utf-8"?>
+<p:properties xmlns:p="http://schemas.microsoft.com/office/2006/metadata/properties" xmlns:xsi="http://www.w3.org/2001/XMLSchema-instance" xmlns:pc="http://schemas.microsoft.com/office/infopath/2007/PartnerControls">
+  <documentManagement>
+    <Status xmlns="71af3243-3dd4-4a8d-8c0d-dd76da1f02a5">Not started</Status>
+    <MediaServiceKeyPoints xmlns="71af3243-3dd4-4a8d-8c0d-dd76da1f02a5" xsi:nil="true"/>
+  </documentManagement>
+</p:properties>
 </file>
 
-<file path=customXml/itemProps2.xml><?xml version="1.0" encoding="utf-8"?>
-<ds:datastoreItem xmlns:ds="http://schemas.openxmlformats.org/officeDocument/2006/customXml" ds:itemID="{4CF6AFD9-3CE3-4EEA-B705-82EE1111B485}">
-  <ds:schemaRefs>
-    <ds:schemaRef ds:uri="http://schemas.microsoft.com/office/2006/metadata/properties"/>
-    <ds:schemaRef ds:uri="http://schemas.microsoft.com/office/infopath/2007/PartnerControls"/>
-    <ds:schemaRef ds:uri="71af3243-3dd4-4a8d-8c0d-dd76da1f02a5"/>
-  </ds:schemaRefs>
-</ds:datastoreItem>
+<file path=customXml/item3.xml><?xml version="1.0" encoding="utf-8"?>
+<?mso-contentType ?>
+<FormTemplates xmlns="http://schemas.microsoft.com/sharepoint/v3/contenttype/forms">
+  <Display>DocumentLibraryForm</Display>
+  <Edit>DocumentLibraryForm</Edit>
+  <New>DocumentLibraryForm</New>
+</FormTemplates>
 </file>
 
-<file path=customXml/itemProps3.xml><?xml version="1.0" encoding="utf-8"?>
+<file path=customXml/itemProps1.xml><?xml version="1.0" encoding="utf-8"?>
 <ds:datastoreItem xmlns:ds="http://schemas.openxmlformats.org/officeDocument/2006/customXml" ds:itemID="{71F0F5CC-BEDC-4A29-93D8-84A715276015}">
   <ds:schemaRefs>
     <ds:schemaRef ds:uri="http://schemas.microsoft.com/office/2006/metadata/contentType"/>
@@ -37924,4 +37896,22 @@
     <ds:schemaRef ds:uri="http://schemas.microsoft.com/internal/obd"/>
   </ds:schemaRefs>
 </ds:datastoreItem>
+</file>
+
+<file path=customXml/itemProps2.xml><?xml version="1.0" encoding="utf-8"?>
+<ds:datastoreItem xmlns:ds="http://schemas.openxmlformats.org/officeDocument/2006/customXml" ds:itemID="{4CF6AFD9-3CE3-4EEA-B705-82EE1111B485}">
+  <ds:schemaRefs>
+    <ds:schemaRef ds:uri="http://schemas.microsoft.com/office/2006/metadata/properties"/>
+    <ds:schemaRef ds:uri="http://schemas.microsoft.com/office/infopath/2007/PartnerControls"/>
+    <ds:schemaRef ds:uri="71af3243-3dd4-4a8d-8c0d-dd76da1f02a5"/>
+  </ds:schemaRefs>
+</ds:datastoreItem>
+</file>
+
+<file path=customXml/itemProps3.xml><?xml version="1.0" encoding="utf-8"?>
+<ds:datastoreItem xmlns:ds="http://schemas.openxmlformats.org/officeDocument/2006/customXml" ds:itemID="{7B9FE982-DDF9-4F2B-80C6-E4D44711D042}">
+  <ds:schemaRefs>
+    <ds:schemaRef ds:uri="http://schemas.microsoft.com/sharepoint/v3/contenttype/forms"/>
+  </ds:schemaRefs>
+</ds:datastoreItem>
 </file>
</xml_diff>